<commit_message>
docs: finalize M1 report and reviewed process materials
</commit_message>
<xml_diff>
--- a/docs/requirements/team-workflow.docx
+++ b/docs/requirements/team-workflow.docx
@@ -642,23 +642,7 @@
       </w:pPr>
       <w:r>
         <w:rPr/>
-        <w:t xml:space="preserve">每人每周投入 </w:t>
-      </w:r>
-      <w:r>
-        <w:rPr/>
-        <w:t xml:space="preserve">10 </w:t>
-      </w:r>
-      <w:r>
-        <w:rPr/>
-        <w:t xml:space="preserve">小时，团队合计约 </w:t>
-      </w:r>
-      <w:r>
-        <w:rPr/>
-        <w:t xml:space="preserve">40 </w:t>
-      </w:r>
-      <w:r>
-        <w:rPr/>
-        <w:t>小时。投入包含开发、文档、会议、复核和返工；重叠里程碑共享该预算。各人负责自己模块的实现、测试、文档和汇报素材。集成缺陷按来源交回对应模块，不集中由组长补修；分配调整由组长结合依赖和实际投入决定。</w:t>
+        <w:t>投入包含开发、文档、会议、复核和返工；重叠里程碑共享该预算。各人负责自己模块的实现、测试、文档和汇报素材。集成缺陷按来源交回对应模块，不集中由组长补修；分配调整由组长结合依赖和实际投入决定。</w:t>
       </w:r>
     </w:p>
     <w:p>
@@ -2763,867 +2747,77 @@
       </w:pPr>
       <w:r>
         <w:rPr/>
-        <w:t xml:space="preserve">表 </w:t>
-      </w:r>
-      <w:r>
-        <w:rPr/>
-        <w:t xml:space="preserve">4 </w:t>
-      </w:r>
-      <w:r>
-        <w:rPr/>
-        <w:t>各阶段时间安排</w:t>
-      </w:r>
-    </w:p>
-    <w:tbl>
-      <w:tblPr>
-        <w:tblW w:w="9864" w:type="dxa"/>
-        <w:jc w:val="start"/>
-        <w:tblInd w:w="0" w:type="dxa"/>
-        <w:tblLayout w:type="fixed"/>
-        <w:tblCellMar>
-          <w:top w:w="0" w:type="dxa"/>
-          <w:start w:w="108" w:type="dxa"/>
-          <w:bottom w:w="0" w:type="dxa"/>
-          <w:end w:w="108" w:type="dxa"/>
-        </w:tblCellMar>
-        <w:tblLook w:val="04a0" w:noHBand="0" w:noVBand="1" w:firstColumn="1" w:lastRow="0" w:lastColumn="0" w:firstRow="1"/>
-      </w:tblPr>
-      <w:tblGrid>
-        <w:gridCol w:w="1928"/>
-        <w:gridCol w:w="1984"/>
-        <w:gridCol w:w="1983"/>
-        <w:gridCol w:w="1985"/>
-        <w:gridCol w:w="1984"/>
-      </w:tblGrid>
-      <w:tr>
-        <w:trPr>
-          <w:tblHeader w:val="true"/>
-          <w:cantSplit w:val="true"/>
-        </w:trPr>
-        <w:tc>
-          <w:tcPr>
-            <w:tcW w:w="1928" w:type="dxa"/>
-            <w:tcBorders>
-              <w:top w:val="single" w:sz="2" w:space="0" w:color="C5C5C5"/>
-              <w:start w:val="single" w:sz="2" w:space="0" w:color="C5C5C5"/>
-              <w:bottom w:val="single" w:sz="2" w:space="0" w:color="C5C5C5"/>
-              <w:end w:val="single" w:sz="2" w:space="0" w:color="C5C5C5"/>
-            </w:tcBorders>
-            <w:shd w:fill="EEEEEE"/>
-          </w:tcPr>
-          <w:p>
-            <w:pPr>
-              <w:pStyle w:val="Normal"/>
-              <w:widowControl w:val="false"/>
-              <w:spacing w:lineRule="auto" w:line="240" w:before="40" w:after="60"/>
-              <w:rPr/>
-            </w:pPr>
-            <w:r>
-              <w:rPr>
-                <w:b/>
-                <w:sz w:val="18"/>
-              </w:rPr>
-              <w:t>阶段与截止日</w:t>
-            </w:r>
-          </w:p>
-        </w:tc>
-        <w:tc>
-          <w:tcPr>
-            <w:tcW w:w="1984" w:type="dxa"/>
-            <w:tcBorders>
-              <w:top w:val="single" w:sz="2" w:space="0" w:color="C5C5C5"/>
-              <w:start w:val="single" w:sz="2" w:space="0" w:color="C5C5C5"/>
-              <w:bottom w:val="single" w:sz="2" w:space="0" w:color="C5C5C5"/>
-              <w:end w:val="single" w:sz="2" w:space="0" w:color="C5C5C5"/>
-            </w:tcBorders>
-            <w:shd w:fill="EEEEEE"/>
-          </w:tcPr>
-          <w:p>
-            <w:pPr>
-              <w:pStyle w:val="Normal"/>
-              <w:widowControl w:val="false"/>
-              <w:spacing w:lineRule="auto" w:line="240" w:before="40" w:after="60"/>
-              <w:rPr/>
-            </w:pPr>
-            <w:r>
-              <w:rPr>
-                <w:b/>
-                <w:sz w:val="18"/>
-              </w:rPr>
-              <w:t>第一轮</w:t>
-            </w:r>
-          </w:p>
-        </w:tc>
-        <w:tc>
-          <w:tcPr>
-            <w:tcW w:w="1983" w:type="dxa"/>
-            <w:tcBorders>
-              <w:top w:val="single" w:sz="2" w:space="0" w:color="C5C5C5"/>
-              <w:start w:val="single" w:sz="2" w:space="0" w:color="C5C5C5"/>
-              <w:bottom w:val="single" w:sz="2" w:space="0" w:color="C5C5C5"/>
-              <w:end w:val="single" w:sz="2" w:space="0" w:color="C5C5C5"/>
-            </w:tcBorders>
-            <w:shd w:fill="EEEEEE"/>
-          </w:tcPr>
-          <w:p>
-            <w:pPr>
-              <w:pStyle w:val="Normal"/>
-              <w:widowControl w:val="false"/>
-              <w:spacing w:lineRule="auto" w:line="240" w:before="40" w:after="60"/>
-              <w:rPr/>
-            </w:pPr>
-            <w:r>
-              <w:rPr>
-                <w:b/>
-                <w:sz w:val="18"/>
-              </w:rPr>
-              <w:t>优化轮</w:t>
-            </w:r>
-          </w:p>
-        </w:tc>
-        <w:tc>
-          <w:tcPr>
-            <w:tcW w:w="1985" w:type="dxa"/>
-            <w:tcBorders>
-              <w:top w:val="single" w:sz="2" w:space="0" w:color="C5C5C5"/>
-              <w:start w:val="single" w:sz="2" w:space="0" w:color="C5C5C5"/>
-              <w:bottom w:val="single" w:sz="2" w:space="0" w:color="C5C5C5"/>
-              <w:end w:val="single" w:sz="2" w:space="0" w:color="C5C5C5"/>
-            </w:tcBorders>
-            <w:shd w:fill="EEEEEE"/>
-          </w:tcPr>
-          <w:p>
-            <w:pPr>
-              <w:pStyle w:val="Normal"/>
-              <w:widowControl w:val="false"/>
-              <w:spacing w:lineRule="auto" w:line="240" w:before="40" w:after="60"/>
-              <w:rPr/>
-            </w:pPr>
-            <w:r>
-              <w:rPr>
-                <w:b/>
-                <w:sz w:val="18"/>
-              </w:rPr>
-              <w:t>收尾轮</w:t>
-            </w:r>
-          </w:p>
-        </w:tc>
-        <w:tc>
-          <w:tcPr>
-            <w:tcW w:w="1984" w:type="dxa"/>
-            <w:tcBorders>
-              <w:top w:val="single" w:sz="2" w:space="0" w:color="C5C5C5"/>
-              <w:start w:val="single" w:sz="2" w:space="0" w:color="C5C5C5"/>
-              <w:bottom w:val="single" w:sz="2" w:space="0" w:color="C5C5C5"/>
-              <w:end w:val="single" w:sz="2" w:space="0" w:color="C5C5C5"/>
-            </w:tcBorders>
-            <w:shd w:fill="EEEEEE"/>
-          </w:tcPr>
-          <w:p>
-            <w:pPr>
-              <w:pStyle w:val="Normal"/>
-              <w:widowControl w:val="false"/>
-              <w:spacing w:lineRule="auto" w:line="240" w:before="40" w:after="60"/>
-              <w:rPr/>
-            </w:pPr>
-            <w:r>
-              <w:rPr>
-                <w:b/>
-                <w:sz w:val="18"/>
-              </w:rPr>
-              <w:t>缓冲</w:t>
-            </w:r>
-          </w:p>
-        </w:tc>
-      </w:tr>
-      <w:tr>
-        <w:trPr>
-          <w:cantSplit w:val="true"/>
-        </w:trPr>
-        <w:tc>
-          <w:tcPr>
-            <w:tcW w:w="1928" w:type="dxa"/>
-            <w:tcBorders>
-              <w:top w:val="single" w:sz="2" w:space="0" w:color="C5C5C5"/>
-              <w:start w:val="single" w:sz="2" w:space="0" w:color="C5C5C5"/>
-              <w:bottom w:val="single" w:sz="2" w:space="0" w:color="C5C5C5"/>
-              <w:end w:val="single" w:sz="2" w:space="0" w:color="C5C5C5"/>
-            </w:tcBorders>
-          </w:tcPr>
-          <w:p>
-            <w:pPr>
-              <w:pStyle w:val="Normal"/>
-              <w:widowControl w:val="false"/>
-              <w:spacing w:lineRule="auto" w:line="240" w:before="40" w:after="60"/>
-              <w:rPr/>
-            </w:pPr>
-            <w:r>
-              <w:rPr>
-                <w:b w:val="false"/>
-                <w:sz w:val="18"/>
-              </w:rPr>
-              <w:t>M1 10/10</w:t>
-            </w:r>
-          </w:p>
-        </w:tc>
-        <w:tc>
-          <w:tcPr>
-            <w:tcW w:w="1984" w:type="dxa"/>
-            <w:tcBorders>
-              <w:top w:val="single" w:sz="2" w:space="0" w:color="C5C5C5"/>
-              <w:start w:val="single" w:sz="2" w:space="0" w:color="C5C5C5"/>
-              <w:bottom w:val="single" w:sz="2" w:space="0" w:color="C5C5C5"/>
-              <w:end w:val="single" w:sz="2" w:space="0" w:color="C5C5C5"/>
-            </w:tcBorders>
-          </w:tcPr>
-          <w:p>
-            <w:pPr>
-              <w:pStyle w:val="Normal"/>
-              <w:widowControl w:val="false"/>
-              <w:spacing w:lineRule="auto" w:line="240" w:before="40" w:after="60"/>
-              <w:rPr/>
-            </w:pPr>
-            <w:r>
-              <w:rPr>
-                <w:b w:val="false"/>
-                <w:sz w:val="18"/>
-              </w:rPr>
-              <w:t>10/5–10/6</w:t>
-            </w:r>
-          </w:p>
-        </w:tc>
-        <w:tc>
-          <w:tcPr>
-            <w:tcW w:w="1983" w:type="dxa"/>
-            <w:tcBorders>
-              <w:top w:val="single" w:sz="2" w:space="0" w:color="C5C5C5"/>
-              <w:start w:val="single" w:sz="2" w:space="0" w:color="C5C5C5"/>
-              <w:bottom w:val="single" w:sz="2" w:space="0" w:color="C5C5C5"/>
-              <w:end w:val="single" w:sz="2" w:space="0" w:color="C5C5C5"/>
-            </w:tcBorders>
-          </w:tcPr>
-          <w:p>
-            <w:pPr>
-              <w:pStyle w:val="Normal"/>
-              <w:widowControl w:val="false"/>
-              <w:spacing w:lineRule="auto" w:line="240" w:before="40" w:after="60"/>
-              <w:rPr/>
-            </w:pPr>
-            <w:r>
-              <w:rPr>
-                <w:b w:val="false"/>
-                <w:sz w:val="18"/>
-              </w:rPr>
-              <w:t>10/7</w:t>
-            </w:r>
-          </w:p>
-        </w:tc>
-        <w:tc>
-          <w:tcPr>
-            <w:tcW w:w="1985" w:type="dxa"/>
-            <w:tcBorders>
-              <w:top w:val="single" w:sz="2" w:space="0" w:color="C5C5C5"/>
-              <w:start w:val="single" w:sz="2" w:space="0" w:color="C5C5C5"/>
-              <w:bottom w:val="single" w:sz="2" w:space="0" w:color="C5C5C5"/>
-              <w:end w:val="single" w:sz="2" w:space="0" w:color="C5C5C5"/>
-            </w:tcBorders>
-          </w:tcPr>
-          <w:p>
-            <w:pPr>
-              <w:pStyle w:val="Normal"/>
-              <w:widowControl w:val="false"/>
-              <w:spacing w:lineRule="auto" w:line="240" w:before="40" w:after="60"/>
-              <w:rPr/>
-            </w:pPr>
-            <w:r>
-              <w:rPr>
-                <w:b w:val="false"/>
-                <w:sz w:val="18"/>
-              </w:rPr>
-              <w:t>10/8</w:t>
-            </w:r>
-          </w:p>
-        </w:tc>
-        <w:tc>
-          <w:tcPr>
-            <w:tcW w:w="1984" w:type="dxa"/>
-            <w:tcBorders>
-              <w:top w:val="single" w:sz="2" w:space="0" w:color="C5C5C5"/>
-              <w:start w:val="single" w:sz="2" w:space="0" w:color="C5C5C5"/>
-              <w:bottom w:val="single" w:sz="2" w:space="0" w:color="C5C5C5"/>
-              <w:end w:val="single" w:sz="2" w:space="0" w:color="C5C5C5"/>
-            </w:tcBorders>
-          </w:tcPr>
-          <w:p>
-            <w:pPr>
-              <w:pStyle w:val="Normal"/>
-              <w:widowControl w:val="false"/>
-              <w:spacing w:lineRule="auto" w:line="240" w:before="40" w:after="60"/>
-              <w:rPr/>
-            </w:pPr>
-            <w:r>
-              <w:rPr>
-                <w:b w:val="false"/>
-                <w:sz w:val="18"/>
-              </w:rPr>
-              <w:t>10/9–10/10</w:t>
-            </w:r>
-          </w:p>
-        </w:tc>
-      </w:tr>
-      <w:tr>
-        <w:trPr>
-          <w:cantSplit w:val="true"/>
-        </w:trPr>
-        <w:tc>
-          <w:tcPr>
-            <w:tcW w:w="1928" w:type="dxa"/>
-            <w:tcBorders>
-              <w:top w:val="single" w:sz="2" w:space="0" w:color="C5C5C5"/>
-              <w:start w:val="single" w:sz="2" w:space="0" w:color="C5C5C5"/>
-              <w:bottom w:val="single" w:sz="2" w:space="0" w:color="C5C5C5"/>
-              <w:end w:val="single" w:sz="2" w:space="0" w:color="C5C5C5"/>
-            </w:tcBorders>
-          </w:tcPr>
-          <w:p>
-            <w:pPr>
-              <w:pStyle w:val="Normal"/>
-              <w:widowControl w:val="false"/>
-              <w:spacing w:lineRule="auto" w:line="240" w:before="40" w:after="60"/>
-              <w:rPr/>
-            </w:pPr>
-            <w:r>
-              <w:rPr>
-                <w:b w:val="false"/>
-                <w:sz w:val="18"/>
-              </w:rPr>
-              <w:t>M2 10/10</w:t>
-            </w:r>
-          </w:p>
-        </w:tc>
-        <w:tc>
-          <w:tcPr>
-            <w:tcW w:w="1984" w:type="dxa"/>
-            <w:tcBorders>
-              <w:top w:val="single" w:sz="2" w:space="0" w:color="C5C5C5"/>
-              <w:start w:val="single" w:sz="2" w:space="0" w:color="C5C5C5"/>
-              <w:bottom w:val="single" w:sz="2" w:space="0" w:color="C5C5C5"/>
-              <w:end w:val="single" w:sz="2" w:space="0" w:color="C5C5C5"/>
-            </w:tcBorders>
-          </w:tcPr>
-          <w:p>
-            <w:pPr>
-              <w:pStyle w:val="Normal"/>
-              <w:widowControl w:val="false"/>
-              <w:spacing w:lineRule="auto" w:line="240" w:before="40" w:after="60"/>
-              <w:rPr/>
-            </w:pPr>
-            <w:r>
-              <w:rPr>
-                <w:b w:val="false"/>
-                <w:sz w:val="18"/>
-              </w:rPr>
-              <w:t>10/5–10/6</w:t>
-            </w:r>
-          </w:p>
-        </w:tc>
-        <w:tc>
-          <w:tcPr>
-            <w:tcW w:w="1983" w:type="dxa"/>
-            <w:tcBorders>
-              <w:top w:val="single" w:sz="2" w:space="0" w:color="C5C5C5"/>
-              <w:start w:val="single" w:sz="2" w:space="0" w:color="C5C5C5"/>
-              <w:bottom w:val="single" w:sz="2" w:space="0" w:color="C5C5C5"/>
-              <w:end w:val="single" w:sz="2" w:space="0" w:color="C5C5C5"/>
-            </w:tcBorders>
-          </w:tcPr>
-          <w:p>
-            <w:pPr>
-              <w:pStyle w:val="Normal"/>
-              <w:widowControl w:val="false"/>
-              <w:spacing w:lineRule="auto" w:line="240" w:before="40" w:after="60"/>
-              <w:rPr/>
-            </w:pPr>
-            <w:r>
-              <w:rPr>
-                <w:b w:val="false"/>
-                <w:sz w:val="18"/>
-              </w:rPr>
-              <w:t>10/7</w:t>
-            </w:r>
-          </w:p>
-        </w:tc>
-        <w:tc>
-          <w:tcPr>
-            <w:tcW w:w="1985" w:type="dxa"/>
-            <w:tcBorders>
-              <w:top w:val="single" w:sz="2" w:space="0" w:color="C5C5C5"/>
-              <w:start w:val="single" w:sz="2" w:space="0" w:color="C5C5C5"/>
-              <w:bottom w:val="single" w:sz="2" w:space="0" w:color="C5C5C5"/>
-              <w:end w:val="single" w:sz="2" w:space="0" w:color="C5C5C5"/>
-            </w:tcBorders>
-          </w:tcPr>
-          <w:p>
-            <w:pPr>
-              <w:pStyle w:val="Normal"/>
-              <w:widowControl w:val="false"/>
-              <w:spacing w:lineRule="auto" w:line="240" w:before="40" w:after="60"/>
-              <w:rPr/>
-            </w:pPr>
-            <w:r>
-              <w:rPr>
-                <w:b w:val="false"/>
-                <w:sz w:val="18"/>
-              </w:rPr>
-              <w:t>10/8</w:t>
-            </w:r>
-          </w:p>
-        </w:tc>
-        <w:tc>
-          <w:tcPr>
-            <w:tcW w:w="1984" w:type="dxa"/>
-            <w:tcBorders>
-              <w:top w:val="single" w:sz="2" w:space="0" w:color="C5C5C5"/>
-              <w:start w:val="single" w:sz="2" w:space="0" w:color="C5C5C5"/>
-              <w:bottom w:val="single" w:sz="2" w:space="0" w:color="C5C5C5"/>
-              <w:end w:val="single" w:sz="2" w:space="0" w:color="C5C5C5"/>
-            </w:tcBorders>
-          </w:tcPr>
-          <w:p>
-            <w:pPr>
-              <w:pStyle w:val="Normal"/>
-              <w:widowControl w:val="false"/>
-              <w:spacing w:lineRule="auto" w:line="240" w:before="40" w:after="60"/>
-              <w:rPr/>
-            </w:pPr>
-            <w:r>
-              <w:rPr>
-                <w:b w:val="false"/>
-                <w:sz w:val="18"/>
-              </w:rPr>
-              <w:t>10/9–10/10</w:t>
-            </w:r>
-          </w:p>
-        </w:tc>
-      </w:tr>
-      <w:tr>
-        <w:trPr>
-          <w:cantSplit w:val="true"/>
-        </w:trPr>
-        <w:tc>
-          <w:tcPr>
-            <w:tcW w:w="1928" w:type="dxa"/>
-            <w:tcBorders>
-              <w:top w:val="single" w:sz="2" w:space="0" w:color="C5C5C5"/>
-              <w:start w:val="single" w:sz="2" w:space="0" w:color="C5C5C5"/>
-              <w:bottom w:val="single" w:sz="2" w:space="0" w:color="C5C5C5"/>
-              <w:end w:val="single" w:sz="2" w:space="0" w:color="C5C5C5"/>
-            </w:tcBorders>
-          </w:tcPr>
-          <w:p>
-            <w:pPr>
-              <w:pStyle w:val="Normal"/>
-              <w:widowControl w:val="false"/>
-              <w:spacing w:lineRule="auto" w:line="240" w:before="40" w:after="60"/>
-              <w:rPr/>
-            </w:pPr>
-            <w:r>
-              <w:rPr>
-                <w:b w:val="false"/>
-                <w:sz w:val="18"/>
-              </w:rPr>
-              <w:t>M3 10/24</w:t>
-            </w:r>
-          </w:p>
-        </w:tc>
-        <w:tc>
-          <w:tcPr>
-            <w:tcW w:w="1984" w:type="dxa"/>
-            <w:tcBorders>
-              <w:top w:val="single" w:sz="2" w:space="0" w:color="C5C5C5"/>
-              <w:start w:val="single" w:sz="2" w:space="0" w:color="C5C5C5"/>
-              <w:bottom w:val="single" w:sz="2" w:space="0" w:color="C5C5C5"/>
-              <w:end w:val="single" w:sz="2" w:space="0" w:color="C5C5C5"/>
-            </w:tcBorders>
-          </w:tcPr>
-          <w:p>
-            <w:pPr>
-              <w:pStyle w:val="Normal"/>
-              <w:widowControl w:val="false"/>
-              <w:spacing w:lineRule="auto" w:line="240" w:before="40" w:after="60"/>
-              <w:rPr/>
-            </w:pPr>
-            <w:r>
-              <w:rPr>
-                <w:b w:val="false"/>
-                <w:sz w:val="18"/>
-              </w:rPr>
-              <w:t>10/11–10/15</w:t>
-            </w:r>
-          </w:p>
-        </w:tc>
-        <w:tc>
-          <w:tcPr>
-            <w:tcW w:w="1983" w:type="dxa"/>
-            <w:tcBorders>
-              <w:top w:val="single" w:sz="2" w:space="0" w:color="C5C5C5"/>
-              <w:start w:val="single" w:sz="2" w:space="0" w:color="C5C5C5"/>
-              <w:bottom w:val="single" w:sz="2" w:space="0" w:color="C5C5C5"/>
-              <w:end w:val="single" w:sz="2" w:space="0" w:color="C5C5C5"/>
-            </w:tcBorders>
-          </w:tcPr>
-          <w:p>
-            <w:pPr>
-              <w:pStyle w:val="Normal"/>
-              <w:widowControl w:val="false"/>
-              <w:spacing w:lineRule="auto" w:line="240" w:before="40" w:after="60"/>
-              <w:rPr/>
-            </w:pPr>
-            <w:r>
-              <w:rPr>
-                <w:b w:val="false"/>
-                <w:sz w:val="18"/>
-              </w:rPr>
-              <w:t>10/16–10/19</w:t>
-            </w:r>
-          </w:p>
-        </w:tc>
-        <w:tc>
-          <w:tcPr>
-            <w:tcW w:w="1985" w:type="dxa"/>
-            <w:tcBorders>
-              <w:top w:val="single" w:sz="2" w:space="0" w:color="C5C5C5"/>
-              <w:start w:val="single" w:sz="2" w:space="0" w:color="C5C5C5"/>
-              <w:bottom w:val="single" w:sz="2" w:space="0" w:color="C5C5C5"/>
-              <w:end w:val="single" w:sz="2" w:space="0" w:color="C5C5C5"/>
-            </w:tcBorders>
-          </w:tcPr>
-          <w:p>
-            <w:pPr>
-              <w:pStyle w:val="Normal"/>
-              <w:widowControl w:val="false"/>
-              <w:spacing w:lineRule="auto" w:line="240" w:before="40" w:after="60"/>
-              <w:rPr/>
-            </w:pPr>
-            <w:r>
-              <w:rPr>
-                <w:b w:val="false"/>
-                <w:sz w:val="18"/>
-              </w:rPr>
-              <w:t>10/20–10/21</w:t>
-            </w:r>
-          </w:p>
-        </w:tc>
-        <w:tc>
-          <w:tcPr>
-            <w:tcW w:w="1984" w:type="dxa"/>
-            <w:tcBorders>
-              <w:top w:val="single" w:sz="2" w:space="0" w:color="C5C5C5"/>
-              <w:start w:val="single" w:sz="2" w:space="0" w:color="C5C5C5"/>
-              <w:bottom w:val="single" w:sz="2" w:space="0" w:color="C5C5C5"/>
-              <w:end w:val="single" w:sz="2" w:space="0" w:color="C5C5C5"/>
-            </w:tcBorders>
-          </w:tcPr>
-          <w:p>
-            <w:pPr>
-              <w:pStyle w:val="Normal"/>
-              <w:widowControl w:val="false"/>
-              <w:spacing w:lineRule="auto" w:line="240" w:before="40" w:after="60"/>
-              <w:rPr/>
-            </w:pPr>
-            <w:r>
-              <w:rPr>
-                <w:b w:val="false"/>
-                <w:sz w:val="18"/>
-              </w:rPr>
-              <w:t>10/22–10/24</w:t>
-            </w:r>
-          </w:p>
-        </w:tc>
-      </w:tr>
-      <w:tr>
-        <w:trPr>
-          <w:cantSplit w:val="true"/>
-        </w:trPr>
-        <w:tc>
-          <w:tcPr>
-            <w:tcW w:w="1928" w:type="dxa"/>
-            <w:tcBorders>
-              <w:top w:val="single" w:sz="2" w:space="0" w:color="C5C5C5"/>
-              <w:start w:val="single" w:sz="2" w:space="0" w:color="C5C5C5"/>
-              <w:bottom w:val="single" w:sz="2" w:space="0" w:color="C5C5C5"/>
-              <w:end w:val="single" w:sz="2" w:space="0" w:color="C5C5C5"/>
-            </w:tcBorders>
-          </w:tcPr>
-          <w:p>
-            <w:pPr>
-              <w:pStyle w:val="Normal"/>
-              <w:widowControl w:val="false"/>
-              <w:spacing w:lineRule="auto" w:line="240" w:before="40" w:after="60"/>
-              <w:rPr/>
-            </w:pPr>
-            <w:r>
-              <w:rPr>
-                <w:b w:val="false"/>
-                <w:sz w:val="18"/>
-              </w:rPr>
-              <w:t>M4 10/24</w:t>
-            </w:r>
-          </w:p>
-        </w:tc>
-        <w:tc>
-          <w:tcPr>
-            <w:tcW w:w="1984" w:type="dxa"/>
-            <w:tcBorders>
-              <w:top w:val="single" w:sz="2" w:space="0" w:color="C5C5C5"/>
-              <w:start w:val="single" w:sz="2" w:space="0" w:color="C5C5C5"/>
-              <w:bottom w:val="single" w:sz="2" w:space="0" w:color="C5C5C5"/>
-              <w:end w:val="single" w:sz="2" w:space="0" w:color="C5C5C5"/>
-            </w:tcBorders>
-          </w:tcPr>
-          <w:p>
-            <w:pPr>
-              <w:pStyle w:val="Normal"/>
-              <w:widowControl w:val="false"/>
-              <w:spacing w:lineRule="auto" w:line="240" w:before="40" w:after="60"/>
-              <w:rPr/>
-            </w:pPr>
-            <w:r>
-              <w:rPr>
-                <w:b w:val="false"/>
-                <w:sz w:val="18"/>
-              </w:rPr>
-              <w:t>10/11–10/17</w:t>
-            </w:r>
-          </w:p>
-        </w:tc>
-        <w:tc>
-          <w:tcPr>
-            <w:tcW w:w="1983" w:type="dxa"/>
-            <w:tcBorders>
-              <w:top w:val="single" w:sz="2" w:space="0" w:color="C5C5C5"/>
-              <w:start w:val="single" w:sz="2" w:space="0" w:color="C5C5C5"/>
-              <w:bottom w:val="single" w:sz="2" w:space="0" w:color="C5C5C5"/>
-              <w:end w:val="single" w:sz="2" w:space="0" w:color="C5C5C5"/>
-            </w:tcBorders>
-          </w:tcPr>
-          <w:p>
-            <w:pPr>
-              <w:pStyle w:val="Normal"/>
-              <w:widowControl w:val="false"/>
-              <w:spacing w:lineRule="auto" w:line="240" w:before="40" w:after="60"/>
-              <w:rPr/>
-            </w:pPr>
-            <w:r>
-              <w:rPr>
-                <w:b w:val="false"/>
-                <w:sz w:val="18"/>
-              </w:rPr>
-              <w:t>10/18–10/19</w:t>
-            </w:r>
-          </w:p>
-        </w:tc>
-        <w:tc>
-          <w:tcPr>
-            <w:tcW w:w="1985" w:type="dxa"/>
-            <w:tcBorders>
-              <w:top w:val="single" w:sz="2" w:space="0" w:color="C5C5C5"/>
-              <w:start w:val="single" w:sz="2" w:space="0" w:color="C5C5C5"/>
-              <w:bottom w:val="single" w:sz="2" w:space="0" w:color="C5C5C5"/>
-              <w:end w:val="single" w:sz="2" w:space="0" w:color="C5C5C5"/>
-            </w:tcBorders>
-          </w:tcPr>
-          <w:p>
-            <w:pPr>
-              <w:pStyle w:val="Normal"/>
-              <w:widowControl w:val="false"/>
-              <w:spacing w:lineRule="auto" w:line="240" w:before="40" w:after="60"/>
-              <w:rPr/>
-            </w:pPr>
-            <w:r>
-              <w:rPr>
-                <w:b w:val="false"/>
-                <w:sz w:val="18"/>
-              </w:rPr>
-              <w:t>10/20–10/21</w:t>
-            </w:r>
-          </w:p>
-        </w:tc>
-        <w:tc>
-          <w:tcPr>
-            <w:tcW w:w="1984" w:type="dxa"/>
-            <w:tcBorders>
-              <w:top w:val="single" w:sz="2" w:space="0" w:color="C5C5C5"/>
-              <w:start w:val="single" w:sz="2" w:space="0" w:color="C5C5C5"/>
-              <w:bottom w:val="single" w:sz="2" w:space="0" w:color="C5C5C5"/>
-              <w:end w:val="single" w:sz="2" w:space="0" w:color="C5C5C5"/>
-            </w:tcBorders>
-          </w:tcPr>
-          <w:p>
-            <w:pPr>
-              <w:pStyle w:val="Normal"/>
-              <w:widowControl w:val="false"/>
-              <w:spacing w:lineRule="auto" w:line="240" w:before="40" w:after="60"/>
-              <w:rPr/>
-            </w:pPr>
-            <w:r>
-              <w:rPr>
-                <w:b w:val="false"/>
-                <w:sz w:val="18"/>
-              </w:rPr>
-              <w:t>10/22–10/24</w:t>
-            </w:r>
-          </w:p>
-        </w:tc>
-      </w:tr>
-      <w:tr>
-        <w:trPr>
-          <w:cantSplit w:val="true"/>
-        </w:trPr>
-        <w:tc>
-          <w:tcPr>
-            <w:tcW w:w="1928" w:type="dxa"/>
-            <w:tcBorders>
-              <w:top w:val="single" w:sz="2" w:space="0" w:color="C5C5C5"/>
-              <w:start w:val="single" w:sz="2" w:space="0" w:color="C5C5C5"/>
-              <w:bottom w:val="single" w:sz="2" w:space="0" w:color="C5C5C5"/>
-              <w:end w:val="single" w:sz="2" w:space="0" w:color="C5C5C5"/>
-            </w:tcBorders>
-          </w:tcPr>
-          <w:p>
-            <w:pPr>
-              <w:pStyle w:val="Normal"/>
-              <w:widowControl w:val="false"/>
-              <w:spacing w:lineRule="auto" w:line="240" w:before="40" w:after="60"/>
-              <w:rPr/>
-            </w:pPr>
-            <w:r>
-              <w:rPr>
-                <w:b w:val="false"/>
-                <w:sz w:val="18"/>
-              </w:rPr>
-              <w:t>M5 11/9</w:t>
-            </w:r>
-          </w:p>
-        </w:tc>
-        <w:tc>
-          <w:tcPr>
-            <w:tcW w:w="1984" w:type="dxa"/>
-            <w:tcBorders>
-              <w:top w:val="single" w:sz="2" w:space="0" w:color="C5C5C5"/>
-              <w:start w:val="single" w:sz="2" w:space="0" w:color="C5C5C5"/>
-              <w:bottom w:val="single" w:sz="2" w:space="0" w:color="C5C5C5"/>
-              <w:end w:val="single" w:sz="2" w:space="0" w:color="C5C5C5"/>
-            </w:tcBorders>
-          </w:tcPr>
-          <w:p>
-            <w:pPr>
-              <w:pStyle w:val="Normal"/>
-              <w:widowControl w:val="false"/>
-              <w:spacing w:lineRule="auto" w:line="240" w:before="40" w:after="60"/>
-              <w:rPr/>
-            </w:pPr>
-            <w:r>
-              <w:rPr>
-                <w:b w:val="false"/>
-                <w:sz w:val="18"/>
-              </w:rPr>
-              <w:t>10/25–11/1</w:t>
-            </w:r>
-          </w:p>
-        </w:tc>
-        <w:tc>
-          <w:tcPr>
-            <w:tcW w:w="1983" w:type="dxa"/>
-            <w:tcBorders>
-              <w:top w:val="single" w:sz="2" w:space="0" w:color="C5C5C5"/>
-              <w:start w:val="single" w:sz="2" w:space="0" w:color="C5C5C5"/>
-              <w:bottom w:val="single" w:sz="2" w:space="0" w:color="C5C5C5"/>
-              <w:end w:val="single" w:sz="2" w:space="0" w:color="C5C5C5"/>
-            </w:tcBorders>
-          </w:tcPr>
-          <w:p>
-            <w:pPr>
-              <w:pStyle w:val="Normal"/>
-              <w:widowControl w:val="false"/>
-              <w:spacing w:lineRule="auto" w:line="240" w:before="40" w:after="60"/>
-              <w:rPr/>
-            </w:pPr>
-            <w:r>
-              <w:rPr>
-                <w:b w:val="false"/>
-                <w:sz w:val="18"/>
-              </w:rPr>
-              <w:t>11/2–11/4</w:t>
-            </w:r>
-          </w:p>
-        </w:tc>
-        <w:tc>
-          <w:tcPr>
-            <w:tcW w:w="1985" w:type="dxa"/>
-            <w:tcBorders>
-              <w:top w:val="single" w:sz="2" w:space="0" w:color="C5C5C5"/>
-              <w:start w:val="single" w:sz="2" w:space="0" w:color="C5C5C5"/>
-              <w:bottom w:val="single" w:sz="2" w:space="0" w:color="C5C5C5"/>
-              <w:end w:val="single" w:sz="2" w:space="0" w:color="C5C5C5"/>
-            </w:tcBorders>
-          </w:tcPr>
-          <w:p>
-            <w:pPr>
-              <w:pStyle w:val="Normal"/>
-              <w:widowControl w:val="false"/>
-              <w:spacing w:lineRule="auto" w:line="240" w:before="40" w:after="60"/>
-              <w:rPr/>
-            </w:pPr>
-            <w:r>
-              <w:rPr>
-                <w:b w:val="false"/>
-                <w:sz w:val="18"/>
-              </w:rPr>
-              <w:t>11/5–11/6</w:t>
-            </w:r>
-          </w:p>
-        </w:tc>
-        <w:tc>
-          <w:tcPr>
-            <w:tcW w:w="1984" w:type="dxa"/>
-            <w:tcBorders>
-              <w:top w:val="single" w:sz="2" w:space="0" w:color="C5C5C5"/>
-              <w:start w:val="single" w:sz="2" w:space="0" w:color="C5C5C5"/>
-              <w:bottom w:val="single" w:sz="2" w:space="0" w:color="C5C5C5"/>
-              <w:end w:val="single" w:sz="2" w:space="0" w:color="C5C5C5"/>
-            </w:tcBorders>
-          </w:tcPr>
-          <w:p>
-            <w:pPr>
-              <w:pStyle w:val="Normal"/>
-              <w:widowControl w:val="false"/>
-              <w:spacing w:lineRule="auto" w:line="240" w:before="40" w:after="60"/>
-              <w:rPr/>
-            </w:pPr>
-            <w:r>
-              <w:rPr>
-                <w:b w:val="false"/>
-                <w:sz w:val="18"/>
-              </w:rPr>
-              <w:t>11/7–11/9</w:t>
-            </w:r>
-          </w:p>
-        </w:tc>
-      </w:tr>
-    </w:tbl>
-    <w:p>
-      <w:pPr>
-        <w:pStyle w:val="Normal"/>
-        <w:rPr/>
-      </w:pPr>
-      <w:r>
-        <w:rPr/>
-        <w:t>组长在例会中核对总量并调整优先级。某个功能的需求与验收先确定，再开展对应实现，不等待全部需求文档统一结束。</w:t>
+        <w:t xml:space="preserve">图 </w:t>
+      </w:r>
+      <w:r>
+        <w:rPr/>
+        <w:t xml:space="preserve">1 </w:t>
+      </w:r>
+      <w:r>
+        <w:rPr/>
+        <w:t>各阶段时间流程</w:t>
       </w:r>
     </w:p>
     <w:p>
       <w:pPr>
+        <w:pStyle w:val="Normal"/>
+        <w:spacing w:lineRule="auto" w:line="240" w:before="0" w:after="80"/>
+        <w:jc w:val="center"/>
+        <w:rPr/>
+      </w:pPr>
+      <w:r>
+        <w:rPr/>
+        <w:drawing>
+          <wp:inline distT="0" distB="0" distL="0" distR="0">
+            <wp:extent cx="6264275" cy="2320290"/>
+            <wp:effectExtent l="0" t="0" r="0" b="0"/>
+            <wp:docPr id="1" name="Picture 1" descr="" title=""/>
+            <wp:cNvGraphicFramePr>
+              <a:graphicFrameLocks xmlns:a="http://schemas.openxmlformats.org/drawingml/2006/main" noChangeAspect="1"/>
+            </wp:cNvGraphicFramePr>
+            <a:graphic xmlns:a="http://schemas.openxmlformats.org/drawingml/2006/main">
+              <a:graphicData uri="http://schemas.openxmlformats.org/drawingml/2006/picture">
+                <pic:pic xmlns:pic="http://schemas.openxmlformats.org/drawingml/2006/picture">
+                  <pic:nvPicPr>
+                    <pic:cNvPr id="1" name="Picture 1" descr="" title=""/>
+                    <pic:cNvPicPr>
+                      <a:picLocks noChangeAspect="1" noChangeArrowheads="1"/>
+                    </pic:cNvPicPr>
+                  </pic:nvPicPr>
+                  <pic:blipFill>
+                    <a:blip r:embed="rId2"/>
+                    <a:stretch>
+                      <a:fillRect/>
+                    </a:stretch>
+                  </pic:blipFill>
+                  <pic:spPr bwMode="auto">
+                    <a:xfrm>
+                      <a:off x="0" y="0"/>
+                      <a:ext cx="6264275" cy="2320290"/>
+                    </a:xfrm>
+                    <a:prstGeom prst="rect">
+                      <a:avLst/>
+                    </a:prstGeom>
+                  </pic:spPr>
+                </pic:pic>
+              </a:graphicData>
+            </a:graphic>
+          </wp:inline>
+        </w:drawing>
+      </w:r>
+    </w:p>
+    <w:p>
+      <w:pPr>
+        <w:pStyle w:val="Normal"/>
+        <w:rPr/>
+      </w:pPr>
+      <w:r>
+        <w:rPr/>
+        <w:t>组长在例会中核对总量并调整优先级。某个功能的需求与验收先确定，再开展对应实现，不等待全部需求文档统一结束。</w:t>
+      </w:r>
+    </w:p>
+    <w:p>
+      <w:pPr>
         <w:pStyle w:val="Caption1"/>
         <w:keepNext w:val="true"/>
         <w:rPr/>
@@ -3634,7 +2828,7 @@
       </w:r>
       <w:r>
         <w:rPr/>
-        <w:t xml:space="preserve">5 </w:t>
+        <w:t xml:space="preserve">4 </w:t>
       </w:r>
       <w:r>
         <w:rPr/>
@@ -4374,7 +3568,7 @@
       </w:r>
       <w:r>
         <w:rPr/>
-        <w:t xml:space="preserve">6 M1 </w:t>
+        <w:t xml:space="preserve">5 M1 </w:t>
       </w:r>
       <w:r>
         <w:rPr/>
@@ -5012,8 +4206,8 @@
       </w:r>
     </w:p>
     <w:sectPr>
-      <w:headerReference w:type="default" r:id="rId2"/>
-      <w:footerReference w:type="default" r:id="rId3"/>
+      <w:headerReference w:type="default" r:id="rId3"/>
+      <w:footerReference w:type="default" r:id="rId4"/>
       <w:type w:val="nextPage"/>
       <w:pgSz w:w="11906" w:h="16838"/>
       <w:pgMar w:left="1020" w:right="1020" w:gutter="0" w:header="397" w:top="935" w:footer="397" w:bottom="935"/>

</xml_diff>